<commit_message>
Touchscreen table actions, master pass, quieter Atlas speaker
The Atlas touchscreen can start, cancel the countdown, rematch and reset
between games. During play its main row is only Pause/Resume and Table; the
Pass button is gone (players pass from their seats). The Table screen holds
Master pass (2 s hold) for a stuck turn and End match (5 s hold).

Master pass is a new Atlas-hardware-only MasterPass Intent: it passes the
active turn at once, clears a queued PASS, waits for open table decisions,
and is logged as ATLAS|GAME|MASTER_PASS plus a master_pass activity entry.
A Game Master's portal pass logs the same line.

Each Atlas speaker volume level is about 10% quieter.

Host scenarios, engineering docs and user manual V0.3 updated.

Co-Authored-By: Claude Opus 5.5 <noreply@anthropic.com>
</commit_message>
<xml_diff>
--- a/Documentation/User Manual/TurnHub Manual V0.3.docx
+++ b/Documentation/User Manual/TurnHub Manual V0.3.docx
@@ -329,7 +329,34 @@
         <w:pStyle w:val="NormalWeb"/>
       </w:pPr>
       <w:r>
-        <w:t xml:space="preserve">The buttons along the bottom change with the game: Pair, QR and Info in the lobby; Pass, Pause and End during a game; Resume and End while paused. A pressed button changes brightness and gains a heavier border, and buttons that must be held say so and count down while you hold them.</w:t>
+        <w:t xml:space="preserve">The buttons along the bottom change with the game: Start (once two players have joined), Pair, QR and Info in the lobby; Cancel start during the countdown; Pause (or Resume) and Table during a game; Rematch, Reset, QR and Info after it. </w:t>
+      </w:r>
+      <w:r>
+        <w:rPr>
+          <w:rStyle w:val="Strong"/>
+        </w:rPr>
+        <w:t xml:space="preserve">Table</w:t>
+      </w:r>
+      <w:r>
+        <w:t xml:space="preserve"> opens the less-used game controls, </w:t>
+      </w:r>
+      <w:r>
+        <w:rPr>
+          <w:rStyle w:val="Strong"/>
+        </w:rPr>
+        <w:t xml:space="preserve">Master pass</w:t>
+      </w:r>
+      <w:r>
+        <w:t xml:space="preserve"> and </w:t>
+      </w:r>
+      <w:r>
+        <w:rPr>
+          <w:rStyle w:val="Strong"/>
+        </w:rPr>
+        <w:t xml:space="preserve">End match</w:t>
+      </w:r>
+      <w:r>
+        <w:t xml:space="preserve">, so they stay out of the way during play. A pressed button changes brightness and gains a heavier border, and buttons that must be held say so and count down while you hold them.</w:t>
       </w:r>
     </w:p>
     <w:p>
@@ -1768,7 +1795,25 @@
         <w:t xml:space="preserve">Start game</w:t>
       </w:r>
       <w:r>
-        <w:t xml:space="preserve">. A 3-second countdown begins, which any seated player can cancel.</w:t>
+        <w:t xml:space="preserve">, or tap </w:t>
+      </w:r>
+      <w:r>
+        <w:rPr>
+          <w:rStyle w:val="Strong"/>
+        </w:rPr>
+        <w:t xml:space="preserve">Start</w:t>
+      </w:r>
+      <w:r>
+        <w:t xml:space="preserve"> on the Atlas screen. A 3-second countdown begins, which any seated player, or </w:t>
+      </w:r>
+      <w:r>
+        <w:rPr>
+          <w:rStyle w:val="Strong"/>
+        </w:rPr>
+        <w:t xml:space="preserve">Cancel start</w:t>
+      </w:r>
+      <w:r>
+        <w:t xml:space="preserve"> on the Atlas screen, can cancel.</w:t>
       </w:r>
     </w:p>
     <w:p>
@@ -1970,25 +2015,73 @@
         <w:t xml:space="preserve">Pass turn</w:t>
       </w:r>
       <w:r>
-        <w:t xml:space="preserve"> on the Sigil (it is the likely choice on your turn), in the browser or app, or tap </w:t>
+        <w:t xml:space="preserve"> on the Sigil (it is the likely choice on your turn), or in the browser or app. For 3 seconds after passing you can change your mind with </w:t>
       </w:r>
       <w:r>
         <w:rPr>
           <w:rStyle w:val="Strong"/>
         </w:rPr>
-        <w:t xml:space="preserve">Pass</w:t>
-      </w:r>
-      <w:r>
-        <w:t xml:space="preserve"> on the Atlas screen. For 3 seconds after passing you can change your mind with </w:t>
+        <w:t xml:space="preserve">Undo pass</w:t>
+      </w:r>
+      <w:r>
+        <w:t xml:space="preserve"> on the Sigil; after that the turn moves on. The Atlas screen shows “Pass pending” meanwhile.</w:t>
+      </w:r>
+    </w:p>
+    <w:p>
+      <w:pPr>
+        <w:pStyle w:val="Heading2"/>
+        <w:rPr>
+          <w:rFonts w:eastAsia="Times New Roman"/>
+        </w:rPr>
+      </w:pPr>
+      <w:r>
+        <w:rPr>
+          <w:rFonts w:eastAsia="Times New Roman"/>
+        </w:rPr>
+        <w:t xml:space="preserve">A Stuck Turn: Master Pass</w:t>
+      </w:r>
+    </w:p>
+    <w:p>
+      <w:pPr>
+        <w:pStyle w:val="NormalWeb"/>
+      </w:pPr>
+      <w:r>
+        <w:t xml:space="preserve">If the active player has stepped away or their Sigil is not responding, anyone at the table can move the game on. On the Atlas screen, tap </w:t>
       </w:r>
       <w:r>
         <w:rPr>
           <w:rStyle w:val="Strong"/>
         </w:rPr>
-        <w:t xml:space="preserve">Undo pass</w:t>
-      </w:r>
-      <w:r>
-        <w:t xml:space="preserve"> on the Sigil or the Atlas screen; after that the turn moves on.</w:t>
+        <w:t xml:space="preserve">Table</w:t>
+      </w:r>
+      <w:r>
+        <w:t xml:space="preserve">, then hold </w:t>
+      </w:r>
+      <w:r>
+        <w:rPr>
+          <w:rStyle w:val="Strong"/>
+        </w:rPr>
+        <w:t xml:space="preserve">Master pass</w:t>
+      </w:r>
+      <w:r>
+        <w:t xml:space="preserve"> for 2 seconds. The turn passes to the next player at once, with no undo window.</w:t>
+      </w:r>
+    </w:p>
+    <w:p>
+      <w:pPr>
+        <w:pStyle w:val="NormalWeb"/>
+      </w:pPr>
+      <w:r>
+        <w:t xml:space="preserve">A master pass is recorded as a master pass, not as that player’s own pass. It is not available while the game is paused or while a win claim or elimination is waiting. A Game Master’s </w:t>
+      </w:r>
+      <w:r>
+        <w:rPr>
+          <w:rStyle w:val="Strong"/>
+        </w:rPr>
+        <w:t xml:space="preserve">Pass turn</w:t>
+      </w:r>
+      <w:r>
+        <w:t xml:space="preserve"> in the browser is recorded the same way.</w:t>
       </w:r>
     </w:p>
     <w:p>
@@ -3160,6 +3253,46 @@
     </w:p>
     <w:p>
       <w:pPr>
+        <w:pStyle w:val="Heading2"/>
+        <w:rPr>
+          <w:rFonts w:eastAsia="Times New Roman"/>
+        </w:rPr>
+      </w:pPr>
+      <w:r>
+        <w:rPr>
+          <w:rFonts w:eastAsia="Times New Roman"/>
+        </w:rPr>
+        <w:t xml:space="preserve">After the Game</w:t>
+      </w:r>
+    </w:p>
+    <w:p>
+      <w:pPr>
+        <w:pStyle w:val="NormalWeb"/>
+      </w:pPr>
+      <w:r>
+        <w:t xml:space="preserve">When a game ends, choose </w:t>
+      </w:r>
+      <w:r>
+        <w:rPr>
+          <w:rStyle w:val="Strong"/>
+        </w:rPr>
+        <w:t xml:space="preserve">Rematch</w:t>
+      </w:r>
+      <w:r>
+        <w:t xml:space="preserve"> to play again with the same players, or </w:t>
+      </w:r>
+      <w:r>
+        <w:rPr>
+          <w:rStyle w:val="Strong"/>
+        </w:rPr>
+        <w:t xml:space="preserve">Reset</w:t>
+      </w:r>
+      <w:r>
+        <w:t xml:space="preserve"> to empty the table. Both are on the Atlas screen as well as on the Sigils and in the browser.</w:t>
+      </w:r>
+    </w:p>
+    <w:p>
+      <w:pPr>
         <w:rPr>
           <w:rFonts w:eastAsia="Times New Roman"/>
         </w:rPr>
@@ -3314,16 +3447,25 @@
         <w:pStyle w:val="NormalWeb"/>
       </w:pPr>
       <w:r>
-        <w:t xml:space="preserve">If a match cannot or should not be finished, for example after a power cut, hold </w:t>
+        <w:t xml:space="preserve">If a match cannot or should not be finished, for example after a power cut, tap </w:t>
       </w:r>
       <w:r>
         <w:rPr>
           <w:rStyle w:val="Strong"/>
         </w:rPr>
-        <w:t xml:space="preserve">End</w:t>
-      </w:r>
-      <w:r>
-        <w:t xml:space="preserve"> on the Atlas screen for 5 seconds while the game is running or paused. The button counts down while you hold it; a shorter press only shows a reminder.</w:t>
+        <w:t xml:space="preserve">Table</w:t>
+      </w:r>
+      <w:r>
+        <w:t xml:space="preserve"> on the Atlas screen, then hold </w:t>
+      </w:r>
+      <w:r>
+        <w:rPr>
+          <w:rStyle w:val="Strong"/>
+        </w:rPr>
+        <w:t xml:space="preserve">End match</w:t>
+      </w:r>
+      <w:r>
+        <w:t xml:space="preserve"> for 5 seconds while the game is running or paused. The button counts down while you hold it; a shorter press only shows a reminder.</w:t>
       </w:r>
     </w:p>
     <w:p>
@@ -4527,7 +4669,7 @@
         <w:pStyle w:val="NormalWeb"/>
       </w:pPr>
       <w:r>
-        <w:t xml:space="preserve">If a game was in progress, it comes back paused. Resume it to continue, or hold End on the Atlas screen for 5 seconds to end it as a draw.</w:t>
+        <w:t xml:space="preserve">If a game was in progress, it comes back paused. Resume it to continue, or tap Table on the Atlas screen and hold End match for 5 seconds to end it as a draw.</w:t>
       </w:r>
     </w:p>
     <w:p>
@@ -5169,7 +5311,16 @@
         <w:pStyle w:val="NormalWeb"/>
       </w:pPr>
       <w:r>
-        <w:t xml:space="preserve">If normal player controls cannot resolve the problem, use Game Master access.</w:t>
+        <w:t xml:space="preserve">If the active player cannot pass, use </w:t>
+      </w:r>
+      <w:r>
+        <w:rPr>
+          <w:rStyle w:val="Strong"/>
+        </w:rPr>
+        <w:t xml:space="preserve">Master pass</w:t>
+      </w:r>
+      <w:r>
+        <w:t xml:space="preserve"> on the Atlas screen’s Table controls (section 8). If that does not resolve the problem, use Game Master access.</w:t>
       </w:r>
     </w:p>
     <w:p>

</xml_diff>

<commit_message>
Manual V0.3: Sigil "Atlas lost" and microSD hot-swap
Light Ring and troubleshooting describe the Atlas lost screen and
light; the microSD section and NO SD CARD fix no longer ask for a
restart.

Co-Authored-By: Claude Opus 5.5 <noreply@anthropic.com>
</commit_message>
<xml_diff>
--- a/Documentation/User Manual/TurnHub Manual V0.3.docx
+++ b/Documentation/User Manual/TurnHub Manual V0.3.docx
@@ -2438,6 +2438,14 @@
     </w:p>
     <w:p>
       <w:pPr>
+        <w:pStyle w:val="NormalWeb"/>
+      </w:pPr>
+      <w:r>
+        <w:t xml:space="preserve">If a Sigil cannot hear Atlas for about 7 seconds (Atlas is switched off, restarting or out of range), its screen says Atlas lost, Searching… (NO ATLAS on the OLED Sigil) and one orange light sweeps back and forth around the ring. With Reduced motion, two opposite lights stay on instead. The menu is hidden and presses are ignored, because nothing can reach Atlas; the Pair button still works. When Atlas answers again, the Sigil returns to its normal screen on its own.</w:t>
+      </w:r>
+    </w:p>
+    <w:p>
+      <w:pPr>
         <w:rPr>
           <w:rFonts w:eastAsia="Times New Roman"/>
         </w:rPr>
@@ -4537,7 +4545,7 @@
         </w:rPr>
       </w:pPr>
       <w:r>
-        <w:t xml:space="preserve">Insert the card before powering on Atlas. A card inserted while Atlas is running is used after the next restart.</w:t>
+        <w:t xml:space="preserve">You can insert or remove the card while Atlas is running. Atlas notices within a few seconds and starts or stops using it without a restart. To be safe, avoid removing it just as a game ends, while Atlas saves statistics.</w:t>
       </w:r>
     </w:p>
     <w:p>
@@ -5154,7 +5162,7 @@
         <w:pStyle w:val="NormalWeb"/>
       </w:pPr>
       <w:r>
-        <w:t xml:space="preserve">Allow the device a moment to reconnect.</w:t>
+        <w:t xml:space="preserve">A Sigil that cannot reach Atlas shows Atlas lost and an orange light sweeping around its ring (section 9). Allow it a moment to reconnect; it returns to its normal screen on its own.</w:t>
       </w:r>
     </w:p>
     <w:p>
@@ -5281,7 +5289,7 @@
         <w:pStyle w:val="NormalWeb"/>
       </w:pPr>
       <w:r>
-        <w:t xml:space="preserve">The game works normally. To keep detailed statistics, insert a microSD card and restart Atlas.</w:t>
+        <w:t xml:space="preserve">The game works normally. To keep detailed statistics, insert a microSD card; Atlas starts using it within a few seconds, without a restart. If the label stays, the card may be unreadable: try another card. Atlas never formats a card.</w:t>
       </w:r>
     </w:p>
     <w:p>

</xml_diff>